<commit_message>
Backup auto 2025-10-13 21:00:24
</commit_message>
<xml_diff>
--- a/09 CAHIER DES CHARGES MAITRE/251012 V2 Cahier des Charges Maître - Projet Usine à Tests V5.docx
+++ b/09 CAHIER DES CHARGES MAITRE/251012 V2 Cahier des Charges Maître - Projet Usine à Tests V5.docx
@@ -109,25 +109,7 @@
           <w:bCs/>
           <w:lang w:val="fr-FR"/>
         </w:rPr>
-        <w:t xml:space="preserve">Inclus pour le Lancement : Le Moteur de Calcul (Pilier 2), la Restitution par </w:t>
-      </w:r>
-      <w:proofErr w:type="gramStart"/>
-      <w:r>
-        <w:rPr>
-          <w:b/>
-          <w:bCs/>
-          <w:lang w:val="fr-FR"/>
-        </w:rPr>
-        <w:t>e-mail</w:t>
-      </w:r>
-      <w:proofErr w:type="gramEnd"/>
-      <w:r>
-        <w:rPr>
-          <w:b/>
-          <w:bCs/>
-          <w:lang w:val="fr-FR"/>
-        </w:rPr>
-        <w:t xml:space="preserve"> avec PDF standards existants (Pilier 3 simplifié), et une gestion du paiement par mots de passe manuels.</w:t>
+        <w:t>Inclus pour le Lancement : Le Moteur de Calcul (Pilier 2), la Restitution par e-mail avec PDF standards existants (Pilier 3 simplifié), et une gestion du paiement par mots de passe manuels.</w:t>
       </w:r>
     </w:p>
     <w:p>
@@ -302,25 +284,7 @@
           <w:bCs/>
           <w:lang w:val="fr-FR"/>
         </w:rPr>
-        <w:t xml:space="preserve">Adoption d'une Stratégie MVP : Le projet est désormais officiellement piloté par une approche de "Produit Minimum Viable" pour accélérer la commercialisation. Le développement se concentrera sur le Moteur de Calcul (Pilier 2), la restitution par </w:t>
-      </w:r>
-      <w:proofErr w:type="gramStart"/>
-      <w:r>
-        <w:rPr>
-          <w:b/>
-          <w:bCs/>
-          <w:lang w:val="fr-FR"/>
-        </w:rPr>
-        <w:t>e-mail</w:t>
-      </w:r>
-      <w:proofErr w:type="gramEnd"/>
-      <w:r>
-        <w:rPr>
-          <w:b/>
-          <w:bCs/>
-          <w:lang w:val="fr-FR"/>
-        </w:rPr>
-        <w:t xml:space="preserve"> avec PDF standards, et un système de paiement manuel.</w:t>
+        <w:t>Adoption d'une Stratégie MVP : Le projet est désormais officiellement piloté par une approche de "Produit Minimum Viable" pour accélérer la commercialisation. Le développement se concentrera sur le Moteur de Calcul (Pilier 2), la restitution par e-mail avec PDF standards, et un système de paiement manuel.</w:t>
       </w:r>
     </w:p>
     <w:p>
@@ -403,6 +367,243 @@
         </w:rPr>
         <w:t>Réévaluation des Risques : Le risque de dépassement des quotas de la plateforme Google est reclassé comme "faible" pour la phase MVP et ne nécessite pas de développement préventif.</w:t>
       </w:r>
+    </w:p>
+    <w:p>
+      <w:pPr>
+        <w:rPr>
+          <w:b/>
+          <w:bCs/>
+          <w:lang w:val="fr-FR"/>
+        </w:rPr>
+      </w:pPr>
+      <w:r>
+        <w:rPr>
+          <w:b/>
+          <w:bCs/>
+          <w:lang w:val="fr-FR"/>
+        </w:rPr>
+        <w:lastRenderedPageBreak/>
+        <w:t>Date : 2025-10-13 Auteur : Assistant IA</w:t>
+      </w:r>
+    </w:p>
+    <w:p>
+      <w:pPr>
+        <w:rPr>
+          <w:b/>
+          <w:bCs/>
+          <w:lang w:val="fr-FR"/>
+        </w:rPr>
+      </w:pPr>
+      <w:r>
+        <w:rPr>
+          <w:b/>
+          <w:bCs/>
+          <w:lang w:val="fr-FR"/>
+        </w:rPr>
+        <w:t>Synthèse des Modifications Stratégiques :</w:t>
+      </w:r>
+    </w:p>
+    <w:p>
+      <w:pPr>
+        <w:numPr>
+          <w:ilvl w:val="0"/>
+          <w:numId w:val="96"/>
+        </w:numPr>
+        <w:rPr>
+          <w:b/>
+          <w:bCs/>
+          <w:lang w:val="fr-FR"/>
+        </w:rPr>
+      </w:pPr>
+      <w:r>
+        <w:rPr>
+          <w:b/>
+          <w:bCs/>
+          <w:lang w:val="fr-FR"/>
+        </w:rPr>
+        <w:t>Validation et Finalisation du Pilier 2 (Moteur de Calcul) : Le Moteur de Calcul est désormais considéré comme techniquement achevé et validé pour le périmètre du MVP. Les tests d'intégration ont confirmé sa capacité à traiter tous les modes de calcul requis (ECHELLE_NOTE, QCU_AXE, QCU_DIRECT, et QCU_CAT/QRM_CAT via la nouvelle architecture à JSON intégré), assurant une base robuste pour la future restitution des résultats.</w:t>
+      </w:r>
+    </w:p>
+    <w:p>
+      <w:pPr>
+        <w:numPr>
+          <w:ilvl w:val="0"/>
+          <w:numId w:val="96"/>
+        </w:numPr>
+        <w:rPr>
+          <w:b/>
+          <w:bCs/>
+          <w:lang w:val="fr-FR"/>
+        </w:rPr>
+      </w:pPr>
+      <w:r>
+        <w:rPr>
+          <w:b/>
+          <w:bCs/>
+          <w:lang w:val="fr-FR"/>
+        </w:rPr>
+        <w:t>Spécification et Implémentation du Module de Paiement (MVP) : Conformément à la stratégie MVP, le système de paiement par mot de passe a été entièrement développé et intégré. Son architecture modulaire et indépendante est officialisée :</w:t>
+      </w:r>
+    </w:p>
+    <w:p>
+      <w:pPr>
+        <w:numPr>
+          <w:ilvl w:val="1"/>
+          <w:numId w:val="96"/>
+        </w:numPr>
+        <w:rPr>
+          <w:b/>
+          <w:bCs/>
+          <w:lang w:val="fr-FR"/>
+        </w:rPr>
+      </w:pPr>
+      <w:r>
+        <w:rPr>
+          <w:b/>
+          <w:bCs/>
+          <w:lang w:val="fr-FR"/>
+        </w:rPr>
+        <w:t>Pilotage par la Configuration : L'activation du paiement est désormais gérée par une nouvelle colonne PAIEMENT_ACTIF (TRUE/FALSE) dans l'onglet Paramètres Généraux du fichier [CONFIG]V5, offrant une flexibilité maximale.</w:t>
+      </w:r>
+    </w:p>
+    <w:p>
+      <w:pPr>
+        <w:numPr>
+          <w:ilvl w:val="1"/>
+          <w:numId w:val="96"/>
+        </w:numPr>
+        <w:rPr>
+          <w:b/>
+          <w:bCs/>
+          <w:lang w:val="fr-FR"/>
+        </w:rPr>
+      </w:pPr>
+      <w:r>
+        <w:rPr>
+          <w:b/>
+          <w:bCs/>
+          <w:lang w:val="fr-FR"/>
+        </w:rPr>
+        <w:t xml:space="preserve">Spécification Technique : La logique est encapsulée dans un module dédié (ModulePaiement.gs) qui s'appuie sur un nouvel onglet </w:t>
+      </w:r>
+      <w:proofErr w:type="spellStart"/>
+      <w:r>
+        <w:rPr>
+          <w:b/>
+          <w:bCs/>
+          <w:lang w:val="fr-FR"/>
+        </w:rPr>
+        <w:t>sys_Mots_De_Passe</w:t>
+      </w:r>
+      <w:proofErr w:type="spellEnd"/>
+      <w:r>
+        <w:rPr>
+          <w:b/>
+          <w:bCs/>
+          <w:lang w:val="fr-FR"/>
+        </w:rPr>
+        <w:t xml:space="preserve"> dans la [BDD]V5 Questionnaires pour vérifier la validité et l'unicité des mots de passe.</w:t>
+      </w:r>
+    </w:p>
+    <w:p>
+      <w:pPr>
+        <w:numPr>
+          <w:ilvl w:val="1"/>
+          <w:numId w:val="96"/>
+        </w:numPr>
+        <w:rPr>
+          <w:b/>
+          <w:bCs/>
+          <w:lang w:val="fr-FR"/>
+        </w:rPr>
+      </w:pPr>
+      <w:r>
+        <w:rPr>
+          <w:b/>
+          <w:bCs/>
+          <w:lang w:val="fr-FR"/>
+        </w:rPr>
+        <w:t>Parcours Utilisateur : Le [HANDLER] a été mis à jour pour servir une page Paiement.html dédiée lorsque le test est configuré comme payant, garantissant une séparation claire des logiques.</w:t>
+      </w:r>
+    </w:p>
+    <w:p>
+      <w:pPr>
+        <w:rPr>
+          <w:b/>
+          <w:bCs/>
+          <w:lang w:val="fr-FR"/>
+        </w:rPr>
+      </w:pPr>
+      <w:r>
+        <w:rPr>
+          <w:b/>
+          <w:bCs/>
+          <w:lang w:val="fr-FR"/>
+        </w:rPr>
+        <w:pict w14:anchorId="3AAA122F">
+          <v:rect id="_x0000_i1038" style="width:0;height:1.5pt" o:hralign="center" o:hrstd="t" o:hr="t" fillcolor="#a0a0a0" stroked="f"/>
+        </w:pict>
+      </w:r>
+    </w:p>
+    <w:p>
+      <w:pPr>
+        <w:rPr>
+          <w:b/>
+          <w:bCs/>
+          <w:lang w:val="fr-FR"/>
+        </w:rPr>
+      </w:pPr>
+      <w:r>
+        <w:rPr>
+          <w:b/>
+          <w:bCs/>
+          <w:lang w:val="fr-FR"/>
+        </w:rPr>
+        <w:t>Maintenant que ce document est produit, nous pouvons reprendre notre plan.</w:t>
+      </w:r>
+    </w:p>
+    <w:p>
+      <w:pPr>
+        <w:rPr>
+          <w:b/>
+          <w:bCs/>
+          <w:lang w:val="fr-FR"/>
+        </w:rPr>
+      </w:pPr>
+      <w:r>
+        <w:rPr>
+          <w:b/>
+          <w:bCs/>
+          <w:lang w:val="fr-FR"/>
+        </w:rPr>
+        <w:t>Étape suivante : Test final du parcours de paiement complet</w:t>
+      </w:r>
+    </w:p>
+    <w:p>
+      <w:pPr>
+        <w:rPr>
+          <w:b/>
+          <w:bCs/>
+          <w:lang w:val="fr-FR"/>
+        </w:rPr>
+      </w:pPr>
+      <w:r>
+        <w:rPr>
+          <w:b/>
+          <w:bCs/>
+          <w:lang w:val="fr-FR"/>
+        </w:rPr>
+        <w:t>Nous sommes prêts à exécuter la Consigne 31 pour tester de bout en bout les scénarios de paiement que nous venons de mettre en place.</w:t>
+      </w:r>
+    </w:p>
+    <w:p>
+      <w:pPr>
+        <w:rPr>
+          <w:b/>
+          <w:bCs/>
+          <w:lang w:val="fr-FR"/>
+        </w:rPr>
+      </w:pPr>
     </w:p>
     <w:p>
       <w:pPr>
@@ -423,7 +624,6 @@
           <w:szCs w:val="32"/>
           <w:lang w:val="fr-FR"/>
         </w:rPr>
-        <w:lastRenderedPageBreak/>
         <w:br/>
       </w:r>
       <w:r>
@@ -524,21 +724,7 @@
         <w:rPr>
           <w:lang w:val="fr-FR"/>
         </w:rPr>
-        <w:t xml:space="preserve"> décompilant toutes les fonctionnalités de l'architecture V2/V3/V4 pour guider le développement de la V5 et s'assurer qu'aucune logique métier n'est </w:t>
-      </w:r>
-      <w:proofErr w:type="gramStart"/>
-      <w:r>
-        <w:rPr>
-          <w:lang w:val="fr-FR"/>
-        </w:rPr>
-        <w:t>oubliée</w:t>
-      </w:r>
-      <w:proofErr w:type="gramEnd"/>
-      <w:r>
-        <w:rPr>
-          <w:lang w:val="fr-FR"/>
-        </w:rPr>
-        <w:t>. Ce document est destiné à être sauvegardé et à servir de base pour tous les futurs échanges.</w:t>
+        <w:t xml:space="preserve"> décompilant toutes les fonctionnalités de l'architecture V2/V3/V4 pour guider le développement de la V5 et s'assurer qu'aucune logique métier n'est oubliée. Ce document est destiné à être sauvegardé et à servir de base pour tous les futurs échanges.</w:t>
       </w:r>
     </w:p>
     <w:p>
@@ -585,21 +771,8 @@
         <w:rPr>
           <w:lang w:val="fr-FR"/>
         </w:rPr>
-        <w:t xml:space="preserve">L'Usine à Tests V5 est une plateforme SaaS (Software as </w:t>
-      </w:r>
-      <w:proofErr w:type="gramStart"/>
-      <w:r>
-        <w:rPr>
-          <w:lang w:val="fr-FR"/>
-        </w:rPr>
-        <w:t>a</w:t>
-      </w:r>
-      <w:proofErr w:type="gramEnd"/>
-      <w:r>
-        <w:rPr>
-          <w:lang w:val="fr-FR"/>
-        </w:rPr>
-        <w:t xml:space="preserve"> Service) permettant de créer, déployer et analyser des questionnaires et tests psychométriques de manière quasi-instantanée. Sa proposition de valeur repose sur trois piliers fondamentaux :</w:t>
+        <w:lastRenderedPageBreak/>
+        <w:t>L'Usine à Tests V5 est une plateforme SaaS (Software as a Service) permettant de créer, déployer et analyser des questionnaires et tests psychométriques de manière quasi-instantanée. Sa proposition de valeur repose sur trois piliers fondamentaux :</w:t>
       </w:r>
     </w:p>
     <w:p>
@@ -797,35 +970,7 @@
         <w:rPr>
           <w:lang w:val="fr-FR"/>
         </w:rPr>
-        <w:t xml:space="preserve"> : Toute la logique métier (questions, calculs, contenu des </w:t>
-      </w:r>
-      <w:proofErr w:type="gramStart"/>
-      <w:r>
-        <w:rPr>
-          <w:lang w:val="fr-FR"/>
-        </w:rPr>
-        <w:t>e-mails</w:t>
-      </w:r>
-      <w:proofErr w:type="gramEnd"/>
-      <w:r>
-        <w:rPr>
-          <w:lang w:val="fr-FR"/>
-        </w:rPr>
-        <w:t xml:space="preserve">, workflows) est </w:t>
-      </w:r>
-      <w:proofErr w:type="gramStart"/>
-      <w:r>
-        <w:rPr>
-          <w:lang w:val="fr-FR"/>
-        </w:rPr>
-        <w:t>externalisée</w:t>
-      </w:r>
-      <w:proofErr w:type="gramEnd"/>
-      <w:r>
-        <w:rPr>
-          <w:lang w:val="fr-FR"/>
-        </w:rPr>
-        <w:t>. Le code est un interpréteur universel de la configuration.</w:t>
+        <w:t xml:space="preserve"> : Toute la logique métier (questions, calculs, contenu des e-mails, workflows) est externalisée. Le code est un interpréteur universel de la configuration.</w:t>
       </w:r>
     </w:p>
     <w:p>
@@ -875,21 +1020,7 @@
         <w:rPr>
           <w:lang w:val="fr-FR"/>
         </w:rPr>
-        <w:t xml:space="preserve"> : Le code doit anticiper les erreurs, gérer des cas variés, nettoyer les données (ex: .trim() sur </w:t>
-      </w:r>
-      <w:proofErr w:type="gramStart"/>
-      <w:r>
-        <w:rPr>
-          <w:lang w:val="fr-FR"/>
-        </w:rPr>
-        <w:t>les ID</w:t>
-      </w:r>
-      <w:proofErr w:type="gramEnd"/>
-      <w:r>
-        <w:rPr>
-          <w:lang w:val="fr-FR"/>
-        </w:rPr>
-        <w:t>), et garantir la robustesse du système.</w:t>
+        <w:t xml:space="preserve"> : Le code doit anticiper les erreurs, gérer des cas variés, nettoyer les données (ex: .trim() sur les ID), et garantir la robustesse du système.</w:t>
       </w:r>
     </w:p>
     <w:p>
@@ -946,7 +1077,6 @@
           <w:bCs/>
           <w:lang w:val="fr-FR"/>
         </w:rPr>
-        <w:lastRenderedPageBreak/>
         <w:t>Partie 2 : Architecture Globale &amp; Flux de Données</w:t>
       </w:r>
     </w:p>
@@ -1226,6 +1356,7 @@
                 <w:bCs/>
                 <w:lang w:val="fr-FR"/>
               </w:rPr>
+              <w:lastRenderedPageBreak/>
               <w:t>[HANDLER]</w:t>
             </w:r>
           </w:p>
@@ -1526,21 +1657,7 @@
         <w:rPr>
           <w:lang w:val="fr-FR"/>
         </w:rPr>
-        <w:t xml:space="preserve"> : Table de correspondance centrale pour </w:t>
-      </w:r>
-      <w:proofErr w:type="gramStart"/>
-      <w:r>
-        <w:rPr>
-          <w:lang w:val="fr-FR"/>
-        </w:rPr>
-        <w:t>les ID</w:t>
-      </w:r>
-      <w:proofErr w:type="gramEnd"/>
-      <w:r>
-        <w:rPr>
-          <w:lang w:val="fr-FR"/>
-        </w:rPr>
-        <w:t xml:space="preserve"> des fichiers critiques (ID_BDD, ID_TEMPLATE_TRAITEMENT_V2, etc.).</w:t>
+        <w:t xml:space="preserve"> : Table de correspondance centrale pour les ID des fichiers critiques (ID_BDD, ID_TEMPLATE_TRAITEMENT_V2, etc.).</w:t>
       </w:r>
     </w:p>
     <w:p>
@@ -1689,7 +1806,6 @@
         <w:rPr>
           <w:lang w:val="fr-FR"/>
         </w:rPr>
-        <w:lastRenderedPageBreak/>
         <w:t xml:space="preserve">Les cases à cocher "Blocs Méta" sont générées en lisant l'onglet </w:t>
       </w:r>
       <w:proofErr w:type="spellStart"/>
@@ -1803,6 +1919,7 @@
           <w:bCs/>
           <w:lang w:val="fr-FR"/>
         </w:rPr>
+        <w:lastRenderedPageBreak/>
         <w:t>Partie 4 : Spécifications Détaillées du Composant [MOTEUR]</w:t>
       </w:r>
     </w:p>
@@ -2184,19 +2301,9 @@
           <w:bCs/>
           <w:lang w:val="fr-FR"/>
         </w:rPr>
-        <w:t>sys_Composition_</w:t>
-      </w:r>
-      <w:proofErr w:type="gramStart"/>
-      <w:r>
-        <w:rPr>
-          <w:b/>
-          <w:bCs/>
-          <w:lang w:val="fr-FR"/>
-        </w:rPr>
-        <w:t>Emails</w:t>
+        <w:t>sys_Composition_Emails</w:t>
       </w:r>
       <w:proofErr w:type="spellEnd"/>
-      <w:proofErr w:type="gramEnd"/>
     </w:p>
     <w:p>
       <w:pPr>
@@ -2319,7 +2426,6 @@
           <w:bCs/>
           <w:lang w:val="fr-FR"/>
         </w:rPr>
-        <w:lastRenderedPageBreak/>
         <w:t>Partie 6 : Spécifications Détaillées du Composant [HANDLER]</w:t>
       </w:r>
     </w:p>
@@ -2425,6 +2531,7 @@
           <w:bCs/>
           <w:lang w:val="fr-FR"/>
         </w:rPr>
+        <w:lastRenderedPageBreak/>
         <w:t>Affichage de l'Identification :</w:t>
       </w:r>
       <w:r>
@@ -2851,7 +2958,6 @@
         <w:rPr>
           <w:lang w:val="fr-FR"/>
         </w:rPr>
-        <w:lastRenderedPageBreak/>
         <w:t xml:space="preserve">Ce modèle est une </w:t>
       </w:r>
       <w:proofErr w:type="spellStart"/>
@@ -2973,6 +3079,7 @@
         <w:rPr>
           <w:lang w:val="fr-FR"/>
         </w:rPr>
+        <w:lastRenderedPageBreak/>
         <w:t>Après le calcul, le moteur lit la configuration de communication (</w:t>
       </w:r>
       <w:proofErr w:type="spellStart"/>
@@ -3085,25 +3192,7 @@
           <w:bCs/>
           <w:lang w:val="fr-FR"/>
         </w:rPr>
-        <w:t xml:space="preserve">Assemblage </w:t>
-      </w:r>
-      <w:proofErr w:type="gramStart"/>
-      <w:r>
-        <w:rPr>
-          <w:b/>
-          <w:bCs/>
-          <w:lang w:val="fr-FR"/>
-        </w:rPr>
-        <w:t>d'E-mail</w:t>
-      </w:r>
-      <w:proofErr w:type="gramEnd"/>
-      <w:r>
-        <w:rPr>
-          <w:b/>
-          <w:bCs/>
-          <w:lang w:val="fr-FR"/>
-        </w:rPr>
-        <w:t xml:space="preserve"> Modulaire :</w:t>
+        <w:t>Assemblage d'E-mail Modulaire :</w:t>
       </w:r>
     </w:p>
     <w:p>
@@ -3127,17 +3216,9 @@
         <w:rPr>
           <w:lang w:val="fr-FR"/>
         </w:rPr>
-        <w:t>sys_Composition_</w:t>
-      </w:r>
-      <w:proofErr w:type="gramStart"/>
-      <w:r>
-        <w:rPr>
-          <w:lang w:val="fr-FR"/>
-        </w:rPr>
-        <w:t>Emails</w:t>
+        <w:t>sys_Composition_Emails</w:t>
       </w:r>
       <w:proofErr w:type="spellEnd"/>
-      <w:proofErr w:type="gramEnd"/>
       <w:r>
         <w:rPr>
           <w:lang w:val="fr-FR"/>
@@ -3413,7 +3494,6 @@
         <w:rPr>
           <w:lang w:val="fr-FR"/>
         </w:rPr>
-        <w:lastRenderedPageBreak/>
         <w:t>Une interface web d'administration doit être prévue pour le retraitement.</w:t>
       </w:r>
     </w:p>
@@ -3495,21 +3575,7 @@
         <w:rPr>
           <w:lang w:val="fr-FR"/>
         </w:rPr>
-        <w:t xml:space="preserve"> (RetraitementUI.html) s'ouvre, affichant les informations de la réponse et des champs pour surcharger les paramètres de restitution (langue, niveau de détail, </w:t>
-      </w:r>
-      <w:proofErr w:type="gramStart"/>
-      <w:r>
-        <w:rPr>
-          <w:lang w:val="fr-FR"/>
-        </w:rPr>
-        <w:t>e-mail</w:t>
-      </w:r>
-      <w:proofErr w:type="gramEnd"/>
-      <w:r>
-        <w:rPr>
-          <w:lang w:val="fr-FR"/>
-        </w:rPr>
-        <w:t xml:space="preserve"> du destinataire).</w:t>
+        <w:t xml:space="preserve"> (RetraitementUI.html) s'ouvre, affichant les informations de la réponse et des champs pour surcharger les paramètres de restitution (langue, niveau de détail, e-mail du destinataire).</w:t>
       </w:r>
     </w:p>
     <w:p>
@@ -3543,6 +3609,7 @@
           <w:bCs/>
           <w:lang w:val="fr-FR"/>
         </w:rPr>
+        <w:lastRenderedPageBreak/>
         <w:t>7.2. Débogage et Maintenance</w:t>
       </w:r>
     </w:p>
@@ -12390,6 +12457,123 @@
     </w:lvl>
   </w:abstractNum>
   <w:abstractNum w:abstractNumId="64" w15:restartNumberingAfterBreak="0">
+    <w:nsid w:val="540A4CB1"/>
+    <w:multiLevelType w:val="multilevel"/>
+    <w:tmpl w:val="D36453C8"/>
+    <w:lvl w:ilvl="0">
+      <w:start w:val="1"/>
+      <w:numFmt w:val="decimal"/>
+      <w:lvlText w:val="%1."/>
+      <w:lvlJc w:val="left"/>
+      <w:pPr>
+        <w:tabs>
+          <w:tab w:val="num" w:pos="720"/>
+        </w:tabs>
+        <w:ind w:left="720" w:hanging="360"/>
+      </w:pPr>
+    </w:lvl>
+    <w:lvl w:ilvl="1">
+      <w:start w:val="1"/>
+      <w:numFmt w:val="bullet"/>
+      <w:lvlText w:val="o"/>
+      <w:lvlJc w:val="left"/>
+      <w:pPr>
+        <w:tabs>
+          <w:tab w:val="num" w:pos="1440"/>
+        </w:tabs>
+        <w:ind w:left="1440" w:hanging="360"/>
+      </w:pPr>
+      <w:rPr>
+        <w:rFonts w:ascii="Courier New" w:hAnsi="Courier New" w:hint="default"/>
+        <w:sz w:val="20"/>
+      </w:rPr>
+    </w:lvl>
+    <w:lvl w:ilvl="2" w:tentative="1">
+      <w:start w:val="1"/>
+      <w:numFmt w:val="decimal"/>
+      <w:lvlText w:val="%3."/>
+      <w:lvlJc w:val="left"/>
+      <w:pPr>
+        <w:tabs>
+          <w:tab w:val="num" w:pos="2160"/>
+        </w:tabs>
+        <w:ind w:left="2160" w:hanging="360"/>
+      </w:pPr>
+    </w:lvl>
+    <w:lvl w:ilvl="3" w:tentative="1">
+      <w:start w:val="1"/>
+      <w:numFmt w:val="decimal"/>
+      <w:lvlText w:val="%4."/>
+      <w:lvlJc w:val="left"/>
+      <w:pPr>
+        <w:tabs>
+          <w:tab w:val="num" w:pos="2880"/>
+        </w:tabs>
+        <w:ind w:left="2880" w:hanging="360"/>
+      </w:pPr>
+    </w:lvl>
+    <w:lvl w:ilvl="4" w:tentative="1">
+      <w:start w:val="1"/>
+      <w:numFmt w:val="decimal"/>
+      <w:lvlText w:val="%5."/>
+      <w:lvlJc w:val="left"/>
+      <w:pPr>
+        <w:tabs>
+          <w:tab w:val="num" w:pos="3600"/>
+        </w:tabs>
+        <w:ind w:left="3600" w:hanging="360"/>
+      </w:pPr>
+    </w:lvl>
+    <w:lvl w:ilvl="5" w:tentative="1">
+      <w:start w:val="1"/>
+      <w:numFmt w:val="decimal"/>
+      <w:lvlText w:val="%6."/>
+      <w:lvlJc w:val="left"/>
+      <w:pPr>
+        <w:tabs>
+          <w:tab w:val="num" w:pos="4320"/>
+        </w:tabs>
+        <w:ind w:left="4320" w:hanging="360"/>
+      </w:pPr>
+    </w:lvl>
+    <w:lvl w:ilvl="6" w:tentative="1">
+      <w:start w:val="1"/>
+      <w:numFmt w:val="decimal"/>
+      <w:lvlText w:val="%7."/>
+      <w:lvlJc w:val="left"/>
+      <w:pPr>
+        <w:tabs>
+          <w:tab w:val="num" w:pos="5040"/>
+        </w:tabs>
+        <w:ind w:left="5040" w:hanging="360"/>
+      </w:pPr>
+    </w:lvl>
+    <w:lvl w:ilvl="7" w:tentative="1">
+      <w:start w:val="1"/>
+      <w:numFmt w:val="decimal"/>
+      <w:lvlText w:val="%8."/>
+      <w:lvlJc w:val="left"/>
+      <w:pPr>
+        <w:tabs>
+          <w:tab w:val="num" w:pos="5760"/>
+        </w:tabs>
+        <w:ind w:left="5760" w:hanging="360"/>
+      </w:pPr>
+    </w:lvl>
+    <w:lvl w:ilvl="8" w:tentative="1">
+      <w:start w:val="1"/>
+      <w:numFmt w:val="decimal"/>
+      <w:lvlText w:val="%9."/>
+      <w:lvlJc w:val="left"/>
+      <w:pPr>
+        <w:tabs>
+          <w:tab w:val="num" w:pos="6480"/>
+        </w:tabs>
+        <w:ind w:left="6480" w:hanging="360"/>
+      </w:pPr>
+    </w:lvl>
+  </w:abstractNum>
+  <w:abstractNum w:abstractNumId="65" w15:restartNumberingAfterBreak="0">
     <w:nsid w:val="54D54826"/>
     <w:multiLevelType w:val="multilevel"/>
     <w:tmpl w:val="4442F282"/>
@@ -12538,7 +12722,7 @@
       </w:rPr>
     </w:lvl>
   </w:abstractNum>
-  <w:abstractNum w:abstractNumId="65" w15:restartNumberingAfterBreak="0">
+  <w:abstractNum w:abstractNumId="66" w15:restartNumberingAfterBreak="0">
     <w:nsid w:val="55444D09"/>
     <w:multiLevelType w:val="multilevel"/>
     <w:tmpl w:val="0D26E236"/>
@@ -12687,7 +12871,7 @@
       </w:rPr>
     </w:lvl>
   </w:abstractNum>
-  <w:abstractNum w:abstractNumId="66" w15:restartNumberingAfterBreak="0">
+  <w:abstractNum w:abstractNumId="67" w15:restartNumberingAfterBreak="0">
     <w:nsid w:val="56610AF4"/>
     <w:multiLevelType w:val="multilevel"/>
     <w:tmpl w:val="B64C35FE"/>
@@ -12800,7 +12984,7 @@
       </w:pPr>
     </w:lvl>
   </w:abstractNum>
-  <w:abstractNum w:abstractNumId="67" w15:restartNumberingAfterBreak="0">
+  <w:abstractNum w:abstractNumId="68" w15:restartNumberingAfterBreak="0">
     <w:nsid w:val="582D7A41"/>
     <w:multiLevelType w:val="multilevel"/>
     <w:tmpl w:val="E15AD1D4"/>
@@ -12913,7 +13097,7 @@
       </w:pPr>
     </w:lvl>
   </w:abstractNum>
-  <w:abstractNum w:abstractNumId="68" w15:restartNumberingAfterBreak="0">
+  <w:abstractNum w:abstractNumId="69" w15:restartNumberingAfterBreak="0">
     <w:nsid w:val="58DB1F57"/>
     <w:multiLevelType w:val="multilevel"/>
     <w:tmpl w:val="20AE14E0"/>
@@ -13062,7 +13246,7 @@
       </w:rPr>
     </w:lvl>
   </w:abstractNum>
-  <w:abstractNum w:abstractNumId="69" w15:restartNumberingAfterBreak="0">
+  <w:abstractNum w:abstractNumId="70" w15:restartNumberingAfterBreak="0">
     <w:nsid w:val="58EB0648"/>
     <w:multiLevelType w:val="multilevel"/>
     <w:tmpl w:val="2B548678"/>
@@ -13175,7 +13359,7 @@
       </w:pPr>
     </w:lvl>
   </w:abstractNum>
-  <w:abstractNum w:abstractNumId="70" w15:restartNumberingAfterBreak="0">
+  <w:abstractNum w:abstractNumId="71" w15:restartNumberingAfterBreak="0">
     <w:nsid w:val="59126087"/>
     <w:multiLevelType w:val="multilevel"/>
     <w:tmpl w:val="C1A437E8"/>
@@ -13324,7 +13508,7 @@
       </w:rPr>
     </w:lvl>
   </w:abstractNum>
-  <w:abstractNum w:abstractNumId="71" w15:restartNumberingAfterBreak="0">
+  <w:abstractNum w:abstractNumId="72" w15:restartNumberingAfterBreak="0">
     <w:nsid w:val="5924022E"/>
     <w:multiLevelType w:val="multilevel"/>
     <w:tmpl w:val="BC9C3474"/>
@@ -13473,7 +13657,7 @@
       </w:rPr>
     </w:lvl>
   </w:abstractNum>
-  <w:abstractNum w:abstractNumId="72" w15:restartNumberingAfterBreak="0">
+  <w:abstractNum w:abstractNumId="73" w15:restartNumberingAfterBreak="0">
     <w:nsid w:val="592F1F93"/>
     <w:multiLevelType w:val="multilevel"/>
     <w:tmpl w:val="FE56F470"/>
@@ -13586,7 +13770,7 @@
       </w:pPr>
     </w:lvl>
   </w:abstractNum>
-  <w:abstractNum w:abstractNumId="73" w15:restartNumberingAfterBreak="0">
+  <w:abstractNum w:abstractNumId="74" w15:restartNumberingAfterBreak="0">
     <w:nsid w:val="59FB4452"/>
     <w:multiLevelType w:val="multilevel"/>
     <w:tmpl w:val="A1A821F2"/>
@@ -13735,7 +13919,7 @@
       </w:rPr>
     </w:lvl>
   </w:abstractNum>
-  <w:abstractNum w:abstractNumId="74" w15:restartNumberingAfterBreak="0">
+  <w:abstractNum w:abstractNumId="75" w15:restartNumberingAfterBreak="0">
     <w:nsid w:val="5B9B1419"/>
     <w:multiLevelType w:val="multilevel"/>
     <w:tmpl w:val="8748645C"/>
@@ -13884,7 +14068,7 @@
       </w:rPr>
     </w:lvl>
   </w:abstractNum>
-  <w:abstractNum w:abstractNumId="75" w15:restartNumberingAfterBreak="0">
+  <w:abstractNum w:abstractNumId="76" w15:restartNumberingAfterBreak="0">
     <w:nsid w:val="62B929C4"/>
     <w:multiLevelType w:val="multilevel"/>
     <w:tmpl w:val="1DA21BD8"/>
@@ -14033,7 +14217,7 @@
       </w:rPr>
     </w:lvl>
   </w:abstractNum>
-  <w:abstractNum w:abstractNumId="76" w15:restartNumberingAfterBreak="0">
+  <w:abstractNum w:abstractNumId="77" w15:restartNumberingAfterBreak="0">
     <w:nsid w:val="685549C5"/>
     <w:multiLevelType w:val="multilevel"/>
     <w:tmpl w:val="97066274"/>
@@ -14146,7 +14330,7 @@
       </w:pPr>
     </w:lvl>
   </w:abstractNum>
-  <w:abstractNum w:abstractNumId="77" w15:restartNumberingAfterBreak="0">
+  <w:abstractNum w:abstractNumId="78" w15:restartNumberingAfterBreak="0">
     <w:nsid w:val="69C45C49"/>
     <w:multiLevelType w:val="multilevel"/>
     <w:tmpl w:val="5AE6BE9E"/>
@@ -14259,7 +14443,7 @@
       </w:pPr>
     </w:lvl>
   </w:abstractNum>
-  <w:abstractNum w:abstractNumId="78" w15:restartNumberingAfterBreak="0">
+  <w:abstractNum w:abstractNumId="79" w15:restartNumberingAfterBreak="0">
     <w:nsid w:val="6AE34C4C"/>
     <w:multiLevelType w:val="multilevel"/>
     <w:tmpl w:val="93DA7914"/>
@@ -14408,7 +14592,7 @@
       </w:rPr>
     </w:lvl>
   </w:abstractNum>
-  <w:abstractNum w:abstractNumId="79" w15:restartNumberingAfterBreak="0">
+  <w:abstractNum w:abstractNumId="80" w15:restartNumberingAfterBreak="0">
     <w:nsid w:val="6B4D3335"/>
     <w:multiLevelType w:val="multilevel"/>
     <w:tmpl w:val="5512F192"/>
@@ -14557,7 +14741,7 @@
       </w:rPr>
     </w:lvl>
   </w:abstractNum>
-  <w:abstractNum w:abstractNumId="80" w15:restartNumberingAfterBreak="0">
+  <w:abstractNum w:abstractNumId="81" w15:restartNumberingAfterBreak="0">
     <w:nsid w:val="6D065E19"/>
     <w:multiLevelType w:val="multilevel"/>
     <w:tmpl w:val="4620CDA4"/>
@@ -14674,7 +14858,7 @@
       </w:pPr>
     </w:lvl>
   </w:abstractNum>
-  <w:abstractNum w:abstractNumId="81" w15:restartNumberingAfterBreak="0">
+  <w:abstractNum w:abstractNumId="82" w15:restartNumberingAfterBreak="0">
     <w:nsid w:val="6E556FCB"/>
     <w:multiLevelType w:val="multilevel"/>
     <w:tmpl w:val="F75C4EFC"/>
@@ -14791,7 +14975,7 @@
       </w:pPr>
     </w:lvl>
   </w:abstractNum>
-  <w:abstractNum w:abstractNumId="82" w15:restartNumberingAfterBreak="0">
+  <w:abstractNum w:abstractNumId="83" w15:restartNumberingAfterBreak="0">
     <w:nsid w:val="727C5F1C"/>
     <w:multiLevelType w:val="multilevel"/>
     <w:tmpl w:val="F64096A0"/>
@@ -14940,7 +15124,7 @@
       </w:rPr>
     </w:lvl>
   </w:abstractNum>
-  <w:abstractNum w:abstractNumId="83" w15:restartNumberingAfterBreak="0">
+  <w:abstractNum w:abstractNumId="84" w15:restartNumberingAfterBreak="0">
     <w:nsid w:val="75946F9A"/>
     <w:multiLevelType w:val="multilevel"/>
     <w:tmpl w:val="531814FE"/>
@@ -15089,7 +15273,7 @@
       </w:rPr>
     </w:lvl>
   </w:abstractNum>
-  <w:abstractNum w:abstractNumId="84" w15:restartNumberingAfterBreak="0">
+  <w:abstractNum w:abstractNumId="85" w15:restartNumberingAfterBreak="0">
     <w:nsid w:val="76544D11"/>
     <w:multiLevelType w:val="multilevel"/>
     <w:tmpl w:val="80D4A8BC"/>
@@ -15238,7 +15422,7 @@
       </w:rPr>
     </w:lvl>
   </w:abstractNum>
-  <w:abstractNum w:abstractNumId="85" w15:restartNumberingAfterBreak="0">
+  <w:abstractNum w:abstractNumId="86" w15:restartNumberingAfterBreak="0">
     <w:nsid w:val="774E325F"/>
     <w:multiLevelType w:val="multilevel"/>
     <w:tmpl w:val="67BE5E96"/>
@@ -15387,7 +15571,7 @@
       </w:rPr>
     </w:lvl>
   </w:abstractNum>
-  <w:abstractNum w:abstractNumId="86" w15:restartNumberingAfterBreak="0">
+  <w:abstractNum w:abstractNumId="87" w15:restartNumberingAfterBreak="0">
     <w:nsid w:val="78E70C84"/>
     <w:multiLevelType w:val="multilevel"/>
     <w:tmpl w:val="A9D0179C"/>
@@ -15532,7 +15716,7 @@
       </w:rPr>
     </w:lvl>
   </w:abstractNum>
-  <w:abstractNum w:abstractNumId="87" w15:restartNumberingAfterBreak="0">
+  <w:abstractNum w:abstractNumId="88" w15:restartNumberingAfterBreak="0">
     <w:nsid w:val="7BB63862"/>
     <w:multiLevelType w:val="multilevel"/>
     <w:tmpl w:val="6B96F350"/>
@@ -15681,7 +15865,7 @@
       </w:rPr>
     </w:lvl>
   </w:abstractNum>
-  <w:abstractNum w:abstractNumId="88" w15:restartNumberingAfterBreak="0">
+  <w:abstractNum w:abstractNumId="89" w15:restartNumberingAfterBreak="0">
     <w:nsid w:val="7E1D70B7"/>
     <w:multiLevelType w:val="multilevel"/>
     <w:tmpl w:val="B82C05B8"/>
@@ -15830,7 +16014,7 @@
       </w:rPr>
     </w:lvl>
   </w:abstractNum>
-  <w:abstractNum w:abstractNumId="89" w15:restartNumberingAfterBreak="0">
+  <w:abstractNum w:abstractNumId="90" w15:restartNumberingAfterBreak="0">
     <w:nsid w:val="7E862FAB"/>
     <w:multiLevelType w:val="multilevel"/>
     <w:tmpl w:val="D11EEBE6"/>
@@ -15951,7 +16135,7 @@
     <w:abstractNumId w:val="33"/>
   </w:num>
   <w:num w:numId="2" w16cid:durableId="455487881">
-    <w:abstractNumId w:val="67"/>
+    <w:abstractNumId w:val="68"/>
   </w:num>
   <w:num w:numId="3" w16cid:durableId="1453012315">
     <w:abstractNumId w:val="5"/>
@@ -15969,7 +16153,7 @@
     <w:abstractNumId w:val="25"/>
   </w:num>
   <w:num w:numId="8" w16cid:durableId="743256064">
-    <w:abstractNumId w:val="77"/>
+    <w:abstractNumId w:val="78"/>
   </w:num>
   <w:num w:numId="9" w16cid:durableId="632060242">
     <w:abstractNumId w:val="37"/>
@@ -15981,7 +16165,7 @@
     <w:abstractNumId w:val="45"/>
   </w:num>
   <w:num w:numId="12" w16cid:durableId="509150871">
-    <w:abstractNumId w:val="68"/>
+    <w:abstractNumId w:val="69"/>
   </w:num>
   <w:num w:numId="13" w16cid:durableId="314797504">
     <w:abstractNumId w:val="15"/>
@@ -15996,7 +16180,7 @@
     <w:abstractNumId w:val="32"/>
   </w:num>
   <w:num w:numId="17" w16cid:durableId="123355413">
-    <w:abstractNumId w:val="72"/>
+    <w:abstractNumId w:val="73"/>
   </w:num>
   <w:num w:numId="18" w16cid:durableId="1790779768">
     <w:abstractNumId w:val="4"/>
@@ -16011,7 +16195,7 @@
     <w:abstractNumId w:val="11"/>
   </w:num>
   <w:num w:numId="22" w16cid:durableId="2001350683">
-    <w:abstractNumId w:val="79"/>
+    <w:abstractNumId w:val="80"/>
   </w:num>
   <w:num w:numId="23" w16cid:durableId="575481409">
     <w:abstractNumId w:val="43"/>
@@ -16020,22 +16204,22 @@
     <w:abstractNumId w:val="59"/>
   </w:num>
   <w:num w:numId="25" w16cid:durableId="820117810">
-    <w:abstractNumId w:val="78"/>
+    <w:abstractNumId w:val="79"/>
   </w:num>
   <w:num w:numId="26" w16cid:durableId="861864248">
     <w:abstractNumId w:val="20"/>
   </w:num>
   <w:num w:numId="27" w16cid:durableId="1985235796">
-    <w:abstractNumId w:val="87"/>
+    <w:abstractNumId w:val="88"/>
   </w:num>
   <w:num w:numId="28" w16cid:durableId="1795975578">
     <w:abstractNumId w:val="10"/>
   </w:num>
   <w:num w:numId="29" w16cid:durableId="1295481229">
-    <w:abstractNumId w:val="83"/>
+    <w:abstractNumId w:val="84"/>
   </w:num>
   <w:num w:numId="30" w16cid:durableId="1501846534">
-    <w:abstractNumId w:val="71"/>
+    <w:abstractNumId w:val="72"/>
   </w:num>
   <w:num w:numId="31" w16cid:durableId="751198912">
     <w:abstractNumId w:val="31"/>
@@ -16065,7 +16249,7 @@
     <w:abstractNumId w:val="40"/>
   </w:num>
   <w:num w:numId="40" w16cid:durableId="1110931175">
-    <w:abstractNumId w:val="76"/>
+    <w:abstractNumId w:val="77"/>
   </w:num>
   <w:num w:numId="41" w16cid:durableId="1627390042">
     <w:abstractNumId w:val="6"/>
@@ -16089,7 +16273,7 @@
     <w:abstractNumId w:val="23"/>
   </w:num>
   <w:num w:numId="48" w16cid:durableId="55012112">
-    <w:abstractNumId w:val="70"/>
+    <w:abstractNumId w:val="71"/>
   </w:num>
   <w:num w:numId="49" w16cid:durableId="1723400978">
     <w:abstractNumId w:val="27"/>
@@ -16101,7 +16285,7 @@
     <w:abstractNumId w:val="14"/>
   </w:num>
   <w:num w:numId="52" w16cid:durableId="1299385294">
-    <w:abstractNumId w:val="80"/>
+    <w:abstractNumId w:val="81"/>
   </w:num>
   <w:num w:numId="53" w16cid:durableId="773330294">
     <w:abstractNumId w:val="0"/>
@@ -16116,19 +16300,19 @@
     <w:abstractNumId w:val="49"/>
   </w:num>
   <w:num w:numId="57" w16cid:durableId="1517310757">
-    <w:abstractNumId w:val="66"/>
+    <w:abstractNumId w:val="67"/>
   </w:num>
   <w:num w:numId="58" w16cid:durableId="1298025185">
-    <w:abstractNumId w:val="89"/>
+    <w:abstractNumId w:val="90"/>
   </w:num>
   <w:num w:numId="59" w16cid:durableId="361439410">
-    <w:abstractNumId w:val="69"/>
+    <w:abstractNumId w:val="70"/>
   </w:num>
   <w:num w:numId="60" w16cid:durableId="121851988">
-    <w:abstractNumId w:val="85"/>
+    <w:abstractNumId w:val="86"/>
   </w:num>
   <w:num w:numId="61" w16cid:durableId="1843161170">
-    <w:abstractNumId w:val="82"/>
+    <w:abstractNumId w:val="83"/>
   </w:num>
   <w:num w:numId="62" w16cid:durableId="1069690513">
     <w:abstractNumId w:val="53"/>
@@ -16146,13 +16330,13 @@
     <w:abstractNumId w:val="58"/>
   </w:num>
   <w:num w:numId="67" w16cid:durableId="932737016">
-    <w:abstractNumId w:val="75"/>
+    <w:abstractNumId w:val="76"/>
   </w:num>
   <w:num w:numId="68" w16cid:durableId="1523781367">
-    <w:abstractNumId w:val="73"/>
+    <w:abstractNumId w:val="74"/>
   </w:num>
   <w:num w:numId="69" w16cid:durableId="1648053501">
-    <w:abstractNumId w:val="65"/>
+    <w:abstractNumId w:val="66"/>
   </w:num>
   <w:num w:numId="70" w16cid:durableId="890002825">
     <w:abstractNumId w:val="50"/>
@@ -16170,7 +16354,7 @@
     <w:abstractNumId w:val="57"/>
   </w:num>
   <w:num w:numId="75" w16cid:durableId="1783920411">
-    <w:abstractNumId w:val="84"/>
+    <w:abstractNumId w:val="85"/>
   </w:num>
   <w:num w:numId="76" w16cid:durableId="154539994">
     <w:abstractNumId w:val="16"/>
@@ -16179,7 +16363,7 @@
     <w:abstractNumId w:val="56"/>
   </w:num>
   <w:num w:numId="78" w16cid:durableId="2112238899">
-    <w:abstractNumId w:val="64"/>
+    <w:abstractNumId w:val="65"/>
   </w:num>
   <w:num w:numId="79" w16cid:durableId="1392579574">
     <w:abstractNumId w:val="35"/>
@@ -16188,7 +16372,7 @@
     <w:abstractNumId w:val="7"/>
   </w:num>
   <w:num w:numId="81" w16cid:durableId="2115713088">
-    <w:abstractNumId w:val="86"/>
+    <w:abstractNumId w:val="87"/>
   </w:num>
   <w:num w:numId="82" w16cid:durableId="1517302454">
     <w:abstractNumId w:val="39"/>
@@ -16303,19 +16487,22 @@
     </w:lvlOverride>
   </w:num>
   <w:num w:numId="91" w16cid:durableId="1570270126">
-    <w:abstractNumId w:val="74"/>
+    <w:abstractNumId w:val="75"/>
   </w:num>
   <w:num w:numId="92" w16cid:durableId="967930940">
     <w:abstractNumId w:val="41"/>
   </w:num>
   <w:num w:numId="93" w16cid:durableId="1515073877">
-    <w:abstractNumId w:val="88"/>
+    <w:abstractNumId w:val="89"/>
   </w:num>
   <w:num w:numId="94" w16cid:durableId="1305237664">
-    <w:abstractNumId w:val="81"/>
+    <w:abstractNumId w:val="82"/>
   </w:num>
   <w:num w:numId="95" w16cid:durableId="1808743286">
     <w:abstractNumId w:val="60"/>
+  </w:num>
+  <w:num w:numId="96" w16cid:durableId="1193420255">
+    <w:abstractNumId w:val="64"/>
   </w:num>
 </w:numbering>
 </file>

</xml_diff>